<commit_message>
Ajusta estrutura de Google Ads: nome confirmado e lista de palavras-chave
Portal do Síndico é o nome definitivo, liberado para uso em anúncios
e palavras-chave. A ativação passa a depender do portal estar com
acesso totalmente liberado (a fase de antecipação/lista de espera
segue só no orgânico, não no Google Ads).

Acrescenta lista de palavras-chave sugeridas com estimativa de volume
de busca médio mensal, para orientar a priorização do orçamento; os
números exatos devem ser conferidos no Planejador de Palavras-chave
antes de travar a distribuição do orçamento.

Co-Authored-By: Claude Sonnet 5 <noreply@anthropic.com>
Claude-Session: https://claude.ai/code/session_01GQSqEjEuqv44iBdACeUWUZ
</commit_message>
<xml_diff>
--- a/eleva/estrutura-google-ads-portal-sindico.docx
+++ b/eleva/estrutura-google-ads-portal-sindico.docx
@@ -223,7 +223,14 @@
           <w:sz w:val="21"/>
           <w:szCs w:val="21"/>
         </w:rPr>
-        <w:t xml:space="preserve">Restrição atual, enquanto o Giuliano não liberar:</w:t>
+        <w:t xml:space="preserve">Nome do produto confirmado:</w:t>
+      </w:r>
+      <w:r>
+        <w:rPr>
+          <w:sz w:val="21"/>
+          <w:szCs w:val="21"/>
+        </w:rPr>
+        <w:t xml:space="preserve"> Portal do Síndico. Pode ser usado normalmente em anúncios, palavras-chave e textos pagos.</w:t>
       </w:r>
     </w:p>
     <w:p>
@@ -237,10 +244,95 @@
       </w:pPr>
       <w:r>
         <w:rPr>
-          <w:sz w:val="21"/>
-          <w:szCs w:val="21"/>
-        </w:rPr>
-        <w:t xml:space="preserve">Não ativar os anúncios ainda — eles só entram depois que a medição de conversão estiver confirmada ("Gravando conversões" no Google Ads) e com o ok dele.</w:t>
+          <w:b/>
+          <w:bCs/>
+          <w:sz w:val="21"/>
+          <w:szCs w:val="21"/>
+        </w:rPr>
+        <w:t xml:space="preserve">Momento de ativação:</w:t>
+      </w:r>
+      <w:r>
+        <w:rPr>
+          <w:sz w:val="21"/>
+          <w:szCs w:val="21"/>
+        </w:rPr>
+        <w:t xml:space="preserve"> os anúncios só entram no ar quando o portal estiver totalmente ativo (fora da fase de antecipação/lista de espera), depois da medição de conversão confirmada ("Gravando conversões" no Google Ads) e com o ok do Giuliano. A fase de antecipação é trabalhada só no orgânico (Instagram e Meta), não no Google Ads.</w:t>
+      </w:r>
+    </w:p>
+    <w:p>
+      <w:pPr>
+        <w:spacing w:after="160"/>
+      </w:pPr>
+      <w:r>
+        <w:rPr>
+          <w:sz w:val="21"/>
+          <w:szCs w:val="21"/>
+        </w:rPr>
+        <w:t xml:space="preserve">Por isso, esta estrutura já vem pronta com o nome do produto, para ser ativada assim que o portal estiver no ar e a medição validada.</w:t>
+      </w:r>
+    </w:p>
+    <w:p>
+      <w:pPr>
+        <w:pBdr>
+          <w:bottom w:val="single" w:color="cccccc" w:sz="6" w:space="4"/>
+        </w:pBdr>
+        <w:spacing w:after="200"/>
+      </w:pPr>
+    </w:p>
+    <w:p>
+      <w:pPr>
+        <w:pStyle w:val="Heading2"/>
+        <w:keepNext/>
+        <w:spacing w:after="150" w:before="300"/>
+      </w:pPr>
+      <w:r>
+        <w:t xml:space="preserve">2. Objetivo da campanha</w:t>
+      </w:r>
+    </w:p>
+    <w:p>
+      <w:pPr>
+        <w:spacing w:after="160"/>
+      </w:pPr>
+      <w:r>
+        <w:rPr>
+          <w:sz w:val="21"/>
+          <w:szCs w:val="21"/>
+        </w:rPr>
+        <w:t xml:space="preserve">Gerar cadastros qualificados no teste grátis de 60 dias, não venda direta. A campanha é de </w:t>
+      </w:r>
+      <w:r>
+        <w:rPr>
+          <w:b/>
+          <w:bCs/>
+          <w:sz w:val="21"/>
+          <w:szCs w:val="21"/>
+        </w:rPr>
+        <w:t xml:space="preserve">geração de leads/cadastro</w:t>
+      </w:r>
+      <w:r>
+        <w:rPr>
+          <w:sz w:val="21"/>
+          <w:szCs w:val="21"/>
+        </w:rPr>
+        <w:t xml:space="preserve">, alinhada com a meta de conversão descrita na medição: "a pessoa começa o teste grátis". Entra no ar só quando o portal estiver com acesso liberado de verdade — a captação antecipada/lista de espera é feita apenas pelo orgânico.</w:t>
+      </w:r>
+    </w:p>
+    <w:p>
+      <w:pPr>
+        <w:pBdr>
+          <w:bottom w:val="single" w:color="cccccc" w:sz="6" w:space="4"/>
+        </w:pBdr>
+        <w:spacing w:after="200"/>
+      </w:pPr>
+    </w:p>
+    <w:p>
+      <w:pPr>
+        <w:pStyle w:val="Heading2"/>
+        <w:keepNext/>
+        <w:spacing w:after="150" w:before="300"/>
+      </w:pPr>
+      <w:r>
+        <w:t xml:space="preserve">3. Orçamento e janela de veiculação</w:t>
       </w:r>
     </w:p>
     <w:p>
@@ -254,102 +346,19 @@
       </w:pPr>
       <w:r>
         <w:rPr>
-          <w:sz w:val="21"/>
-          <w:szCs w:val="21"/>
-        </w:rPr>
-        <w:t xml:space="preserve">Não usar o termo </w:t>
-      </w:r>
-      <w:r>
-        <w:rPr>
           <w:b/>
           <w:bCs/>
           <w:sz w:val="21"/>
           <w:szCs w:val="21"/>
         </w:rPr>
-        <w:t xml:space="preserve">"Portal do Síndico"</w:t>
-      </w:r>
-      <w:r>
-        <w:rPr>
-          <w:sz w:val="21"/>
-          <w:szCs w:val="21"/>
-        </w:rPr>
-        <w:t xml:space="preserve"> em anúncios, palavras-chave ou textos pagos até ele confirmar o nome definitivo do produto.</w:t>
-      </w:r>
-    </w:p>
-    <w:p>
-      <w:pPr>
-        <w:spacing w:after="160"/>
-      </w:pPr>
-      <w:r>
-        <w:rPr>
-          <w:sz w:val="21"/>
-          <w:szCs w:val="21"/>
-        </w:rPr>
-        <w:t xml:space="preserve">Por isso, esta estrutura já vem pronta para ativar assim que a medição for validada, mas construída sem o nome "Portal do Síndico" nos elementos pagos — usando, por enquanto, "portal de gestão para síndicos" como termo guarda-chuva. Trocar pelo nome definitivo assim que o Giuliano confirmar.</w:t>
-      </w:r>
-    </w:p>
-    <w:p>
-      <w:pPr>
-        <w:pBdr>
-          <w:bottom w:val="single" w:color="cccccc" w:sz="6" w:space="4"/>
-        </w:pBdr>
-        <w:spacing w:after="200"/>
-      </w:pPr>
-    </w:p>
-    <w:p>
-      <w:pPr>
-        <w:pStyle w:val="Heading2"/>
-        <w:keepNext/>
-        <w:spacing w:after="150" w:before="300"/>
-      </w:pPr>
-      <w:r>
-        <w:t xml:space="preserve">2. Objetivo da campanha</w:t>
-      </w:r>
-    </w:p>
-    <w:p>
-      <w:pPr>
-        <w:spacing w:after="160"/>
-      </w:pPr>
-      <w:r>
-        <w:rPr>
-          <w:sz w:val="21"/>
-          <w:szCs w:val="21"/>
-        </w:rPr>
-        <w:t xml:space="preserve">Gerar cadastros qualificados no teste grátis de 60 dias, não venda direta. A campanha é de </w:t>
-      </w:r>
-      <w:r>
-        <w:rPr>
-          <w:b/>
-          <w:bCs/>
-          <w:sz w:val="21"/>
-          <w:szCs w:val="21"/>
-        </w:rPr>
-        <w:t xml:space="preserve">geração de leads/cadastro</w:t>
-      </w:r>
-      <w:r>
-        <w:rPr>
-          <w:sz w:val="21"/>
-          <w:szCs w:val="21"/>
-        </w:rPr>
-        <w:t xml:space="preserve">, alinhada com a fase de lançamento (outubro–novembro) e com a meta de conversão descrita na medição: "a pessoa começa o teste grátis".</w:t>
-      </w:r>
-    </w:p>
-    <w:p>
-      <w:pPr>
-        <w:pBdr>
-          <w:bottom w:val="single" w:color="cccccc" w:sz="6" w:space="4"/>
-        </w:pBdr>
-        <w:spacing w:after="200"/>
-      </w:pPr>
-    </w:p>
-    <w:p>
-      <w:pPr>
-        <w:pStyle w:val="Heading2"/>
-        <w:keepNext/>
-        <w:spacing w:after="150" w:before="300"/>
-      </w:pPr>
-      <w:r>
-        <w:t xml:space="preserve">3. Orçamento e janela de veiculação</w:t>
+        <w:t xml:space="preserve">Saldo disponível:</w:t>
+      </w:r>
+      <w:r>
+        <w:rPr>
+          <w:sz w:val="21"/>
+          <w:szCs w:val="21"/>
+        </w:rPr>
+        <w:t xml:space="preserve"> R$ 1.500,00</w:t>
       </w:r>
     </w:p>
     <w:p>
@@ -368,14 +377,14 @@
           <w:sz w:val="21"/>
           <w:szCs w:val="21"/>
         </w:rPr>
-        <w:t xml:space="preserve">Saldo disponível:</w:t>
-      </w:r>
-      <w:r>
-        <w:rPr>
-          <w:sz w:val="21"/>
-          <w:szCs w:val="21"/>
-        </w:rPr>
-        <w:t xml:space="preserve"> R$ 1.500,00</w:t>
+        <w:t xml:space="preserve">Janela sugerida:</w:t>
+      </w:r>
+      <w:r>
+        <w:rPr>
+          <w:sz w:val="21"/>
+          <w:szCs w:val="21"/>
+        </w:rPr>
+        <w:t xml:space="preserve"> pouco mais de um mês, para já captar o fim da leva de outubro e boa parte de novembro, que é quando a campanha de cadastro orgânica também ganha força (conforme calendário de marketing).</w:t>
       </w:r>
     </w:p>
     <w:p>
@@ -394,14 +403,30 @@
           <w:sz w:val="21"/>
           <w:szCs w:val="21"/>
         </w:rPr>
-        <w:t xml:space="preserve">Janela sugerida:</w:t>
-      </w:r>
-      <w:r>
-        <w:rPr>
-          <w:sz w:val="21"/>
-          <w:szCs w:val="21"/>
-        </w:rPr>
-        <w:t xml:space="preserve"> pouco mais de um mês, para já captar o fim da leva de outubro e boa parte de novembro, que é quando a campanha de cadastro orgânica também ganha força (conforme calendário de marketing).</w:t>
+        <w:t xml:space="preserve">Orçamento diário sugerido:</w:t>
+      </w:r>
+      <w:r>
+        <w:rPr>
+          <w:sz w:val="21"/>
+          <w:szCs w:val="21"/>
+        </w:rPr>
+        <w:t xml:space="preserve"> R$ 1.500 ÷ 35 dias ≈ </w:t>
+      </w:r>
+      <w:r>
+        <w:rPr>
+          <w:b/>
+          <w:bCs/>
+          <w:sz w:val="21"/>
+          <w:szCs w:val="21"/>
+        </w:rPr>
+        <w:t xml:space="preserve">R$ 43/dia</w:t>
+      </w:r>
+      <w:r>
+        <w:rPr>
+          <w:sz w:val="21"/>
+          <w:szCs w:val="21"/>
+        </w:rPr>
+        <w:t xml:space="preserve">, com liberdade para o sistema remanejar entre campanhas conforme desempenho.</w:t>
       </w:r>
     </w:p>
     <w:p>
@@ -420,48 +445,6 @@
           <w:sz w:val="21"/>
           <w:szCs w:val="21"/>
         </w:rPr>
-        <w:t xml:space="preserve">Orçamento diário sugerido:</w:t>
-      </w:r>
-      <w:r>
-        <w:rPr>
-          <w:sz w:val="21"/>
-          <w:szCs w:val="21"/>
-        </w:rPr>
-        <w:t xml:space="preserve"> R$ 1.500 ÷ 35 dias ≈ </w:t>
-      </w:r>
-      <w:r>
-        <w:rPr>
-          <w:b/>
-          <w:bCs/>
-          <w:sz w:val="21"/>
-          <w:szCs w:val="21"/>
-        </w:rPr>
-        <w:t xml:space="preserve">R$ 43/dia</w:t>
-      </w:r>
-      <w:r>
-        <w:rPr>
-          <w:sz w:val="21"/>
-          <w:szCs w:val="21"/>
-        </w:rPr>
-        <w:t xml:space="preserve">, com liberdade para o sistema remanejar entre campanhas conforme desempenho.</w:t>
-      </w:r>
-    </w:p>
-    <w:p>
-      <w:pPr>
-        <w:pStyle w:val="ListParagraph"/>
-        <w:numPr>
-          <w:ilvl w:val="0"/>
-          <w:numId w:val="1"/>
-        </w:numPr>
-        <w:spacing w:after="80"/>
-      </w:pPr>
-      <w:r>
-        <w:rPr>
-          <w:b/>
-          <w:bCs/>
-          <w:sz w:val="21"/>
-          <w:szCs w:val="21"/>
-        </w:rPr>
         <w:t xml:space="preserve">Estratégia de lance:</w:t>
       </w:r>
       <w:r>
@@ -502,7 +485,7 @@
           <w:sz w:val="22"/>
           <w:szCs w:val="22"/>
         </w:rPr>
-        <w:t xml:space="preserve">Campanha 1 — Pesquisa | Portal Síndico | Captação de Cadastro</w:t>
+        <w:t xml:space="preserve">Campanha 1 — Pesquisa | Portal do Síndico | Captação de Cadastro</w:t>
       </w:r>
     </w:p>
     <w:p>
@@ -600,7 +583,7 @@
                 <w:sz w:val="19"/>
                 <w:szCs w:val="19"/>
               </w:rPr>
-              <w:t xml:space="preserve">Exemplos de palavras-chave (sem citar o nome do produto)</w:t>
+              <w:t xml:space="preserve">Exemplos de palavras-chave</w:t>
             </w:r>
           </w:p>
         </w:tc>
@@ -619,41 +602,41 @@
                 <w:sz w:val="19"/>
                 <w:szCs w:val="19"/>
               </w:rPr>
-              <w:t xml:space="preserve">Gestão do síndico</w:t>
-            </w:r>
-          </w:p>
-        </w:tc>
-        <w:tc>
-          <w:tcPr>
-            <w:tcW w:type="dxa" w:w="3008"/>
-          </w:tcPr>
-          <w:p>
-            <w:r>
-              <w:rPr>
-                <w:b w:val="false"/>
-                <w:bCs w:val="false"/>
-                <w:color w:val="000000"/>
-                <w:sz w:val="19"/>
-                <w:szCs w:val="19"/>
-              </w:rPr>
-              <w:t xml:space="preserve">Dores do dia a dia</w:t>
-            </w:r>
-          </w:p>
-        </w:tc>
-        <w:tc>
-          <w:tcPr>
-            <w:tcW w:type="dxa" w:w="3008"/>
-          </w:tcPr>
-          <w:p>
-            <w:r>
-              <w:rPr>
-                <w:b w:val="false"/>
-                <w:bCs w:val="false"/>
-                <w:color w:val="000000"/>
-                <w:sz w:val="19"/>
-                <w:szCs w:val="19"/>
-              </w:rPr>
-              <w:t xml:space="preserve">"sistema para síndico", "programa de gestão de condomínio", "ferramenta para administrar condomínio"</w:t>
+              <w:t xml:space="preserve">Marca/produto</w:t>
+            </w:r>
+          </w:p>
+        </w:tc>
+        <w:tc>
+          <w:tcPr>
+            <w:tcW w:type="dxa" w:w="3008"/>
+          </w:tcPr>
+          <w:p>
+            <w:r>
+              <w:rPr>
+                <w:b w:val="false"/>
+                <w:bCs w:val="false"/>
+                <w:color w:val="000000"/>
+                <w:sz w:val="19"/>
+                <w:szCs w:val="19"/>
+              </w:rPr>
+              <w:t xml:space="preserve">Quem já ouviu falar do portal</w:t>
+            </w:r>
+          </w:p>
+        </w:tc>
+        <w:tc>
+          <w:tcPr>
+            <w:tcW w:type="dxa" w:w="3008"/>
+          </w:tcPr>
+          <w:p>
+            <w:r>
+              <w:rPr>
+                <w:b w:val="false"/>
+                <w:bCs w:val="false"/>
+                <w:color w:val="000000"/>
+                <w:sz w:val="19"/>
+                <w:szCs w:val="19"/>
+              </w:rPr>
+              <w:t xml:space="preserve">"portal do síndico", "portal do síndico eleva", "eleva portal do síndico"</w:t>
             </w:r>
           </w:p>
         </w:tc>
@@ -672,41 +655,41 @@
                 <w:sz w:val="19"/>
                 <w:szCs w:val="19"/>
               </w:rPr>
-              <w:t xml:space="preserve">Prazos e obrigações</w:t>
-            </w:r>
-          </w:p>
-        </w:tc>
-        <w:tc>
-          <w:tcPr>
-            <w:tcW w:type="dxa" w:w="3008"/>
-          </w:tcPr>
-          <w:p>
-            <w:r>
-              <w:rPr>
-                <w:b w:val="false"/>
-                <w:bCs w:val="false"/>
-                <w:color w:val="000000"/>
-                <w:sz w:val="19"/>
-                <w:szCs w:val="19"/>
-              </w:rPr>
-              <w:t xml:space="preserve">Obrigações legais e manutenções</w:t>
-            </w:r>
-          </w:p>
-        </w:tc>
-        <w:tc>
-          <w:tcPr>
-            <w:tcW w:type="dxa" w:w="3008"/>
-          </w:tcPr>
-          <w:p>
-            <w:r>
-              <w:rPr>
-                <w:b w:val="false"/>
-                <w:bCs w:val="false"/>
-                <w:color w:val="000000"/>
-                <w:sz w:val="19"/>
-                <w:szCs w:val="19"/>
-              </w:rPr>
-              <w:t xml:space="preserve">"controle de obrigações do condomínio", "prazos de manutenção predial", "AVCB extintor vencimento condomínio"</w:t>
+              <w:t xml:space="preserve">Gestão do síndico</w:t>
+            </w:r>
+          </w:p>
+        </w:tc>
+        <w:tc>
+          <w:tcPr>
+            <w:tcW w:type="dxa" w:w="3008"/>
+          </w:tcPr>
+          <w:p>
+            <w:r>
+              <w:rPr>
+                <w:b w:val="false"/>
+                <w:bCs w:val="false"/>
+                <w:color w:val="000000"/>
+                <w:sz w:val="19"/>
+                <w:szCs w:val="19"/>
+              </w:rPr>
+              <w:t xml:space="preserve">Dores do dia a dia</w:t>
+            </w:r>
+          </w:p>
+        </w:tc>
+        <w:tc>
+          <w:tcPr>
+            <w:tcW w:type="dxa" w:w="3008"/>
+          </w:tcPr>
+          <w:p>
+            <w:r>
+              <w:rPr>
+                <w:b w:val="false"/>
+                <w:bCs w:val="false"/>
+                <w:color w:val="000000"/>
+                <w:sz w:val="19"/>
+                <w:szCs w:val="19"/>
+              </w:rPr>
+              <w:t xml:space="preserve">"sistema para síndico", "programa de gestão de condomínio", "ferramenta para administrar condomínio", "aplicativo para síndico"</w:t>
             </w:r>
           </w:p>
         </w:tc>
@@ -725,41 +708,41 @@
                 <w:sz w:val="19"/>
                 <w:szCs w:val="19"/>
               </w:rPr>
-              <w:t xml:space="preserve">Prestação de contas</w:t>
-            </w:r>
-          </w:p>
-        </w:tc>
-        <w:tc>
-          <w:tcPr>
-            <w:tcW w:type="dxa" w:w="3008"/>
-          </w:tcPr>
-          <w:p>
-            <w:r>
-              <w:rPr>
-                <w:b w:val="false"/>
-                <w:bCs w:val="false"/>
-                <w:color w:val="000000"/>
-                <w:sz w:val="19"/>
-                <w:szCs w:val="19"/>
-              </w:rPr>
-              <w:t xml:space="preserve">Gestão financeira do condomínio</w:t>
-            </w:r>
-          </w:p>
-        </w:tc>
-        <w:tc>
-          <w:tcPr>
-            <w:tcW w:type="dxa" w:w="3008"/>
-          </w:tcPr>
-          <w:p>
-            <w:r>
-              <w:rPr>
-                <w:b w:val="false"/>
-                <w:bCs w:val="false"/>
-                <w:color w:val="000000"/>
-                <w:sz w:val="19"/>
-                <w:szCs w:val="19"/>
-              </w:rPr>
-              <w:t xml:space="preserve">"prestação de contas condomínio", "sistema financeiro para condomínio", "orçamento condomínio online"</w:t>
+              <w:t xml:space="preserve">Prazos e obrigações</w:t>
+            </w:r>
+          </w:p>
+        </w:tc>
+        <w:tc>
+          <w:tcPr>
+            <w:tcW w:type="dxa" w:w="3008"/>
+          </w:tcPr>
+          <w:p>
+            <w:r>
+              <w:rPr>
+                <w:b w:val="false"/>
+                <w:bCs w:val="false"/>
+                <w:color w:val="000000"/>
+                <w:sz w:val="19"/>
+                <w:szCs w:val="19"/>
+              </w:rPr>
+              <w:t xml:space="preserve">Obrigações legais e manutenções</w:t>
+            </w:r>
+          </w:p>
+        </w:tc>
+        <w:tc>
+          <w:tcPr>
+            <w:tcW w:type="dxa" w:w="3008"/>
+          </w:tcPr>
+          <w:p>
+            <w:r>
+              <w:rPr>
+                <w:b w:val="false"/>
+                <w:bCs w:val="false"/>
+                <w:color w:val="000000"/>
+                <w:sz w:val="19"/>
+                <w:szCs w:val="19"/>
+              </w:rPr>
+              <w:t xml:space="preserve">"controle de obrigações do condomínio", "prazos de manutenção predial", "AVCB extintor vencimento condomínio"</w:t>
             </w:r>
           </w:p>
         </w:tc>
@@ -778,6 +761,59 @@
                 <w:sz w:val="19"/>
                 <w:szCs w:val="19"/>
               </w:rPr>
+              <w:t xml:space="preserve">Prestação de contas</w:t>
+            </w:r>
+          </w:p>
+        </w:tc>
+        <w:tc>
+          <w:tcPr>
+            <w:tcW w:type="dxa" w:w="3008"/>
+          </w:tcPr>
+          <w:p>
+            <w:r>
+              <w:rPr>
+                <w:b w:val="false"/>
+                <w:bCs w:val="false"/>
+                <w:color w:val="000000"/>
+                <w:sz w:val="19"/>
+                <w:szCs w:val="19"/>
+              </w:rPr>
+              <w:t xml:space="preserve">Gestão financeira do condomínio</w:t>
+            </w:r>
+          </w:p>
+        </w:tc>
+        <w:tc>
+          <w:tcPr>
+            <w:tcW w:type="dxa" w:w="3008"/>
+          </w:tcPr>
+          <w:p>
+            <w:r>
+              <w:rPr>
+                <w:b w:val="false"/>
+                <w:bCs w:val="false"/>
+                <w:color w:val="000000"/>
+                <w:sz w:val="19"/>
+                <w:szCs w:val="19"/>
+              </w:rPr>
+              <w:t xml:space="preserve">"prestação de contas condomínio", "sistema financeiro para condomínio", "orçamento condomínio online"</w:t>
+            </w:r>
+          </w:p>
+        </w:tc>
+      </w:tr>
+      <w:tr>
+        <w:tc>
+          <w:tcPr>
+            <w:tcW w:type="dxa" w:w="3008"/>
+          </w:tcPr>
+          <w:p>
+            <w:r>
+              <w:rPr>
+                <w:b w:val="false"/>
+                <w:bCs w:val="false"/>
+                <w:color w:val="000000"/>
+                <w:sz w:val="19"/>
+                <w:szCs w:val="19"/>
+              </w:rPr>
               <w:t xml:space="preserve">Administradoras e carteiras</w:t>
             </w:r>
           </w:p>
@@ -812,7 +848,7 @@
                 <w:sz w:val="19"/>
                 <w:szCs w:val="19"/>
               </w:rPr>
-              <w:t xml:space="preserve">"sistema para administradora de condomínios", "gestão de carteira de condomínios"</w:t>
+              <w:t xml:space="preserve">"sistema para administradora de condomínios", "gestão de carteira de condomínios", "software para administradora de condomínio"</w:t>
             </w:r>
           </w:p>
         </w:tc>
@@ -872,7 +908,717 @@
           <w:sz w:val="21"/>
           <w:szCs w:val="21"/>
         </w:rPr>
-        <w:t xml:space="preserve"> termos de emprego ("vaga síndico", "concurso"), termos de outros segmentos (ex.: "seguro residencial" isolado, que não é o produto), termos de "grátis" descolados de contexto, se gerarem tráfego não qualificado.</w:t>
+        <w:t xml:space="preserve"> termos de emprego ("vaga síndico", "concurso", "salário síndico"), termos de outros segmentos (ex.: "seguro residencial" isolado, que não é o produto), termos de "grátis" descolados de contexto, se gerarem tráfego não qualificado.</w:t>
+      </w:r>
+    </w:p>
+    <w:p>
+      <w:pPr>
+        <w:spacing w:after="80"/>
+      </w:pPr>
+      <w:r>
+        <w:rPr>
+          <w:i/>
+          <w:iCs/>
+          <w:color w:val="555555"/>
+          <w:sz w:val="18"/>
+          <w:szCs w:val="18"/>
+        </w:rPr>
+        <w:t xml:space="preserve">Volume de busca médio mensal (Brasil) — estimativa de referência</w:t>
+      </w:r>
+    </w:p>
+    <w:p>
+      <w:pPr>
+        <w:spacing w:after="160"/>
+      </w:pPr>
+      <w:r>
+        <w:rPr>
+          <w:sz w:val="21"/>
+          <w:szCs w:val="21"/>
+        </w:rPr>
+        <w:t xml:space="preserve">Estimativas aproximadas com base no comportamento típico desse nicho, para orientar a priorização. Como o termo "Portal do Síndico" é de marca própria (baixo ou nenhum histórico de busca ainda), o volume real precisa ser conferido no Planejador de Palavras-chave do Google Ads antes de travar o orçamento por grupo — ele é a fonte oficial e vai mostrar o número exato por termo e por região.</w:t>
+      </w:r>
+    </w:p>
+    <w:tbl>
+      <w:tblPr>
+        <w:tblW w:type="dxa" w:w="9026"/>
+        <w:tblBorders>
+          <w:top w:val="single" w:color="auto" w:sz="4"/>
+          <w:left w:val="single" w:color="auto" w:sz="4"/>
+          <w:bottom w:val="single" w:color="auto" w:sz="4"/>
+          <w:right w:val="single" w:color="auto" w:sz="4"/>
+          <w:insideH w:val="single" w:color="auto" w:sz="4"/>
+          <w:insideV w:val="single" w:color="auto" w:sz="4"/>
+        </w:tblBorders>
+      </w:tblPr>
+      <w:tblGrid>
+        <w:gridCol w:w="3008"/>
+        <w:gridCol w:w="3008"/>
+        <w:gridCol w:w="3008"/>
+      </w:tblGrid>
+      <w:tr>
+        <w:tc>
+          <w:tcPr>
+            <w:tcW w:type="dxa" w:w="3008"/>
+            <w:shd w:fill="1c2b4a" w:val="clear"/>
+          </w:tcPr>
+          <w:p>
+            <w:r>
+              <w:rPr>
+                <w:b/>
+                <w:bCs/>
+                <w:color w:val="FFFFFF"/>
+                <w:sz w:val="19"/>
+                <w:szCs w:val="19"/>
+              </w:rPr>
+              <w:t xml:space="preserve">Palavra-chave</w:t>
+            </w:r>
+          </w:p>
+        </w:tc>
+        <w:tc>
+          <w:tcPr>
+            <w:tcW w:type="dxa" w:w="3008"/>
+            <w:shd w:fill="1c2b4a" w:val="clear"/>
+          </w:tcPr>
+          <w:p>
+            <w:r>
+              <w:rPr>
+                <w:b/>
+                <w:bCs/>
+                <w:color w:val="FFFFFF"/>
+                <w:sz w:val="19"/>
+                <w:szCs w:val="19"/>
+              </w:rPr>
+              <w:t xml:space="preserve">Volume médio mensal estimado</w:t>
+            </w:r>
+          </w:p>
+        </w:tc>
+        <w:tc>
+          <w:tcPr>
+            <w:tcW w:type="dxa" w:w="3008"/>
+            <w:shd w:fill="1c2b4a" w:val="clear"/>
+          </w:tcPr>
+          <w:p>
+            <w:r>
+              <w:rPr>
+                <w:b/>
+                <w:bCs/>
+                <w:color w:val="FFFFFF"/>
+                <w:sz w:val="19"/>
+                <w:szCs w:val="19"/>
+              </w:rPr>
+              <w:t xml:space="preserve">Observação</w:t>
+            </w:r>
+          </w:p>
+        </w:tc>
+      </w:tr>
+      <w:tr>
+        <w:tc>
+          <w:tcPr>
+            <w:tcW w:type="dxa" w:w="3008"/>
+          </w:tcPr>
+          <w:p>
+            <w:r>
+              <w:rPr>
+                <w:b w:val="false"/>
+                <w:bCs w:val="false"/>
+                <w:color w:val="000000"/>
+                <w:sz w:val="19"/>
+                <w:szCs w:val="19"/>
+              </w:rPr>
+              <w:t xml:space="preserve">sistema para síndico</w:t>
+            </w:r>
+          </w:p>
+        </w:tc>
+        <w:tc>
+          <w:tcPr>
+            <w:tcW w:type="dxa" w:w="3008"/>
+          </w:tcPr>
+          <w:p>
+            <w:r>
+              <w:rPr>
+                <w:b w:val="false"/>
+                <w:bCs w:val="false"/>
+                <w:color w:val="000000"/>
+                <w:sz w:val="19"/>
+                <w:szCs w:val="19"/>
+              </w:rPr>
+              <w:t xml:space="preserve">100–1.000</w:t>
+            </w:r>
+          </w:p>
+        </w:tc>
+        <w:tc>
+          <w:tcPr>
+            <w:tcW w:type="dxa" w:w="3008"/>
+          </w:tcPr>
+          <w:p>
+            <w:r>
+              <w:rPr>
+                <w:b w:val="false"/>
+                <w:bCs w:val="false"/>
+                <w:color w:val="000000"/>
+                <w:sz w:val="19"/>
+                <w:szCs w:val="19"/>
+              </w:rPr>
+              <w:t xml:space="preserve">Termo de maior potencial, intenção direta</w:t>
+            </w:r>
+          </w:p>
+        </w:tc>
+      </w:tr>
+      <w:tr>
+        <w:tc>
+          <w:tcPr>
+            <w:tcW w:type="dxa" w:w="3008"/>
+          </w:tcPr>
+          <w:p>
+            <w:r>
+              <w:rPr>
+                <w:b w:val="false"/>
+                <w:bCs w:val="false"/>
+                <w:color w:val="000000"/>
+                <w:sz w:val="19"/>
+                <w:szCs w:val="19"/>
+              </w:rPr>
+              <w:t xml:space="preserve">programa de gestão de condomínio</w:t>
+            </w:r>
+          </w:p>
+        </w:tc>
+        <w:tc>
+          <w:tcPr>
+            <w:tcW w:type="dxa" w:w="3008"/>
+          </w:tcPr>
+          <w:p>
+            <w:r>
+              <w:rPr>
+                <w:b w:val="false"/>
+                <w:bCs w:val="false"/>
+                <w:color w:val="000000"/>
+                <w:sz w:val="19"/>
+                <w:szCs w:val="19"/>
+              </w:rPr>
+              <w:t xml:space="preserve">100–1.000</w:t>
+            </w:r>
+          </w:p>
+        </w:tc>
+        <w:tc>
+          <w:tcPr>
+            <w:tcW w:type="dxa" w:w="3008"/>
+          </w:tcPr>
+          <w:p>
+            <w:r>
+              <w:rPr>
+                <w:b w:val="false"/>
+                <w:bCs w:val="false"/>
+                <w:color w:val="000000"/>
+                <w:sz w:val="19"/>
+                <w:szCs w:val="19"/>
+              </w:rPr>
+              <w:t xml:space="preserve">Boa intenção, público que já pesquisa solução</w:t>
+            </w:r>
+          </w:p>
+        </w:tc>
+      </w:tr>
+      <w:tr>
+        <w:tc>
+          <w:tcPr>
+            <w:tcW w:type="dxa" w:w="3008"/>
+          </w:tcPr>
+          <w:p>
+            <w:r>
+              <w:rPr>
+                <w:b w:val="false"/>
+                <w:bCs w:val="false"/>
+                <w:color w:val="000000"/>
+                <w:sz w:val="19"/>
+                <w:szCs w:val="19"/>
+              </w:rPr>
+              <w:t xml:space="preserve">aplicativo para síndico</w:t>
+            </w:r>
+          </w:p>
+        </w:tc>
+        <w:tc>
+          <w:tcPr>
+            <w:tcW w:type="dxa" w:w="3008"/>
+          </w:tcPr>
+          <w:p>
+            <w:r>
+              <w:rPr>
+                <w:b w:val="false"/>
+                <w:bCs w:val="false"/>
+                <w:color w:val="000000"/>
+                <w:sz w:val="19"/>
+                <w:szCs w:val="19"/>
+              </w:rPr>
+              <w:t xml:space="preserve">100–1.000</w:t>
+            </w:r>
+          </w:p>
+        </w:tc>
+        <w:tc>
+          <w:tcPr>
+            <w:tcW w:type="dxa" w:w="3008"/>
+          </w:tcPr>
+          <w:p>
+            <w:r>
+              <w:rPr>
+                <w:b w:val="false"/>
+                <w:bCs w:val="false"/>
+                <w:color w:val="000000"/>
+                <w:sz w:val="19"/>
+                <w:szCs w:val="19"/>
+              </w:rPr>
+              <w:t xml:space="preserve">Formato "aplicativo" tem busca consistente</w:t>
+            </w:r>
+          </w:p>
+        </w:tc>
+      </w:tr>
+      <w:tr>
+        <w:tc>
+          <w:tcPr>
+            <w:tcW w:type="dxa" w:w="3008"/>
+          </w:tcPr>
+          <w:p>
+            <w:r>
+              <w:rPr>
+                <w:b w:val="false"/>
+                <w:bCs w:val="false"/>
+                <w:color w:val="000000"/>
+                <w:sz w:val="19"/>
+                <w:szCs w:val="19"/>
+              </w:rPr>
+              <w:t xml:space="preserve">gestão de condomínio sistema online</w:t>
+            </w:r>
+          </w:p>
+        </w:tc>
+        <w:tc>
+          <w:tcPr>
+            <w:tcW w:type="dxa" w:w="3008"/>
+          </w:tcPr>
+          <w:p>
+            <w:r>
+              <w:rPr>
+                <w:b w:val="false"/>
+                <w:bCs w:val="false"/>
+                <w:color w:val="000000"/>
+                <w:sz w:val="19"/>
+                <w:szCs w:val="19"/>
+              </w:rPr>
+              <w:t xml:space="preserve">10–100</w:t>
+            </w:r>
+          </w:p>
+        </w:tc>
+        <w:tc>
+          <w:tcPr>
+            <w:tcW w:type="dxa" w:w="3008"/>
+          </w:tcPr>
+          <w:p>
+            <w:r>
+              <w:rPr>
+                <w:b w:val="false"/>
+                <w:bCs w:val="false"/>
+                <w:color w:val="000000"/>
+                <w:sz w:val="19"/>
+                <w:szCs w:val="19"/>
+              </w:rPr>
+              <w:t xml:space="preserve">Cauda um pouco mais longa, qualificada</w:t>
+            </w:r>
+          </w:p>
+        </w:tc>
+      </w:tr>
+      <w:tr>
+        <w:tc>
+          <w:tcPr>
+            <w:tcW w:type="dxa" w:w="3008"/>
+          </w:tcPr>
+          <w:p>
+            <w:r>
+              <w:rPr>
+                <w:b w:val="false"/>
+                <w:bCs w:val="false"/>
+                <w:color w:val="000000"/>
+                <w:sz w:val="19"/>
+                <w:szCs w:val="19"/>
+              </w:rPr>
+              <w:t xml:space="preserve">prestação de contas condomínio</w:t>
+            </w:r>
+          </w:p>
+        </w:tc>
+        <w:tc>
+          <w:tcPr>
+            <w:tcW w:type="dxa" w:w="3008"/>
+          </w:tcPr>
+          <w:p>
+            <w:r>
+              <w:rPr>
+                <w:b w:val="false"/>
+                <w:bCs w:val="false"/>
+                <w:color w:val="000000"/>
+                <w:sz w:val="19"/>
+                <w:szCs w:val="19"/>
+              </w:rPr>
+              <w:t xml:space="preserve">100–1.000</w:t>
+            </w:r>
+          </w:p>
+        </w:tc>
+        <w:tc>
+          <w:tcPr>
+            <w:tcW w:type="dxa" w:w="3008"/>
+          </w:tcPr>
+          <w:p>
+            <w:r>
+              <w:rPr>
+                <w:b w:val="false"/>
+                <w:bCs w:val="false"/>
+                <w:color w:val="000000"/>
+                <w:sz w:val="19"/>
+                <w:szCs w:val="19"/>
+              </w:rPr>
+              <w:t xml:space="preserve">Alto volume, mas intenção mais informacional — vale testar</w:t>
+            </w:r>
+          </w:p>
+        </w:tc>
+      </w:tr>
+      <w:tr>
+        <w:tc>
+          <w:tcPr>
+            <w:tcW w:type="dxa" w:w="3008"/>
+          </w:tcPr>
+          <w:p>
+            <w:r>
+              <w:rPr>
+                <w:b w:val="false"/>
+                <w:bCs w:val="false"/>
+                <w:color w:val="000000"/>
+                <w:sz w:val="19"/>
+                <w:szCs w:val="19"/>
+              </w:rPr>
+              <w:t xml:space="preserve">sistema financeiro para condomínio</w:t>
+            </w:r>
+          </w:p>
+        </w:tc>
+        <w:tc>
+          <w:tcPr>
+            <w:tcW w:type="dxa" w:w="3008"/>
+          </w:tcPr>
+          <w:p>
+            <w:r>
+              <w:rPr>
+                <w:b w:val="false"/>
+                <w:bCs w:val="false"/>
+                <w:color w:val="000000"/>
+                <w:sz w:val="19"/>
+                <w:szCs w:val="19"/>
+              </w:rPr>
+              <w:t xml:space="preserve">10–100</w:t>
+            </w:r>
+          </w:p>
+        </w:tc>
+        <w:tc>
+          <w:tcPr>
+            <w:tcW w:type="dxa" w:w="3008"/>
+          </w:tcPr>
+          <w:p>
+            <w:r>
+              <w:rPr>
+                <w:b w:val="false"/>
+                <w:bCs w:val="false"/>
+                <w:color w:val="000000"/>
+                <w:sz w:val="19"/>
+                <w:szCs w:val="19"/>
+              </w:rPr>
+              <w:t xml:space="preserve">Intenção específica, público profissional</w:t>
+            </w:r>
+          </w:p>
+        </w:tc>
+      </w:tr>
+      <w:tr>
+        <w:tc>
+          <w:tcPr>
+            <w:tcW w:type="dxa" w:w="3008"/>
+          </w:tcPr>
+          <w:p>
+            <w:r>
+              <w:rPr>
+                <w:b w:val="false"/>
+                <w:bCs w:val="false"/>
+                <w:color w:val="000000"/>
+                <w:sz w:val="19"/>
+                <w:szCs w:val="19"/>
+              </w:rPr>
+              <w:t xml:space="preserve">controle de obrigações do condomínio</w:t>
+            </w:r>
+          </w:p>
+        </w:tc>
+        <w:tc>
+          <w:tcPr>
+            <w:tcW w:type="dxa" w:w="3008"/>
+          </w:tcPr>
+          <w:p>
+            <w:r>
+              <w:rPr>
+                <w:b w:val="false"/>
+                <w:bCs w:val="false"/>
+                <w:color w:val="000000"/>
+                <w:sz w:val="19"/>
+                <w:szCs w:val="19"/>
+              </w:rPr>
+              <w:t xml:space="preserve">10–100</w:t>
+            </w:r>
+          </w:p>
+        </w:tc>
+        <w:tc>
+          <w:tcPr>
+            <w:tcW w:type="dxa" w:w="3008"/>
+          </w:tcPr>
+          <w:p>
+            <w:r>
+              <w:rPr>
+                <w:b w:val="false"/>
+                <w:bCs w:val="false"/>
+                <w:color w:val="000000"/>
+                <w:sz w:val="19"/>
+                <w:szCs w:val="19"/>
+              </w:rPr>
+              <w:t xml:space="preserve">Cauda longa, baixo volume mas alta qualificação</w:t>
+            </w:r>
+          </w:p>
+        </w:tc>
+      </w:tr>
+      <w:tr>
+        <w:tc>
+          <w:tcPr>
+            <w:tcW w:type="dxa" w:w="3008"/>
+          </w:tcPr>
+          <w:p>
+            <w:r>
+              <w:rPr>
+                <w:b w:val="false"/>
+                <w:bCs w:val="false"/>
+                <w:color w:val="000000"/>
+                <w:sz w:val="19"/>
+                <w:szCs w:val="19"/>
+              </w:rPr>
+              <w:t xml:space="preserve">AVCB extintor vencimento condomínio</w:t>
+            </w:r>
+          </w:p>
+        </w:tc>
+        <w:tc>
+          <w:tcPr>
+            <w:tcW w:type="dxa" w:w="3008"/>
+          </w:tcPr>
+          <w:p>
+            <w:r>
+              <w:rPr>
+                <w:b w:val="false"/>
+                <w:bCs w:val="false"/>
+                <w:color w:val="000000"/>
+                <w:sz w:val="19"/>
+                <w:szCs w:val="19"/>
+              </w:rPr>
+              <w:t xml:space="preserve">10–100</w:t>
+            </w:r>
+          </w:p>
+        </w:tc>
+        <w:tc>
+          <w:tcPr>
+            <w:tcW w:type="dxa" w:w="3008"/>
+          </w:tcPr>
+          <w:p>
+            <w:r>
+              <w:rPr>
+                <w:b w:val="false"/>
+                <w:bCs w:val="false"/>
+                <w:color w:val="000000"/>
+                <w:sz w:val="19"/>
+                <w:szCs w:val="19"/>
+              </w:rPr>
+              <w:t xml:space="preserve">Muito específico, custo por clique tende a ser baixo</w:t>
+            </w:r>
+          </w:p>
+        </w:tc>
+      </w:tr>
+      <w:tr>
+        <w:tc>
+          <w:tcPr>
+            <w:tcW w:type="dxa" w:w="3008"/>
+          </w:tcPr>
+          <w:p>
+            <w:r>
+              <w:rPr>
+                <w:b w:val="false"/>
+                <w:bCs w:val="false"/>
+                <w:color w:val="000000"/>
+                <w:sz w:val="19"/>
+                <w:szCs w:val="19"/>
+              </w:rPr>
+              <w:t xml:space="preserve">sistema para administradora de condomínios</w:t>
+            </w:r>
+          </w:p>
+        </w:tc>
+        <w:tc>
+          <w:tcPr>
+            <w:tcW w:type="dxa" w:w="3008"/>
+          </w:tcPr>
+          <w:p>
+            <w:r>
+              <w:rPr>
+                <w:b w:val="false"/>
+                <w:bCs w:val="false"/>
+                <w:color w:val="000000"/>
+                <w:sz w:val="19"/>
+                <w:szCs w:val="19"/>
+              </w:rPr>
+              <w:t xml:space="preserve">10–100</w:t>
+            </w:r>
+          </w:p>
+        </w:tc>
+        <w:tc>
+          <w:tcPr>
+            <w:tcW w:type="dxa" w:w="3008"/>
+          </w:tcPr>
+          <w:p>
+            <w:r>
+              <w:rPr>
+                <w:b w:val="false"/>
+                <w:bCs w:val="false"/>
+                <w:color w:val="000000"/>
+                <w:sz w:val="19"/>
+                <w:szCs w:val="19"/>
+              </w:rPr>
+              <w:t xml:space="preserve">Público profissional/administradoras</w:t>
+            </w:r>
+          </w:p>
+        </w:tc>
+      </w:tr>
+      <w:tr>
+        <w:tc>
+          <w:tcPr>
+            <w:tcW w:type="dxa" w:w="3008"/>
+          </w:tcPr>
+          <w:p>
+            <w:r>
+              <w:rPr>
+                <w:b w:val="false"/>
+                <w:bCs w:val="false"/>
+                <w:color w:val="000000"/>
+                <w:sz w:val="19"/>
+                <w:szCs w:val="19"/>
+              </w:rPr>
+              <w:t xml:space="preserve">gestão de carteira de condomínios</w:t>
+            </w:r>
+          </w:p>
+        </w:tc>
+        <w:tc>
+          <w:tcPr>
+            <w:tcW w:type="dxa" w:w="3008"/>
+          </w:tcPr>
+          <w:p>
+            <w:r>
+              <w:rPr>
+                <w:b w:val="false"/>
+                <w:bCs w:val="false"/>
+                <w:color w:val="000000"/>
+                <w:sz w:val="19"/>
+                <w:szCs w:val="19"/>
+              </w:rPr>
+              <w:t xml:space="preserve">10–100</w:t>
+            </w:r>
+          </w:p>
+        </w:tc>
+        <w:tc>
+          <w:tcPr>
+            <w:tcW w:type="dxa" w:w="3008"/>
+          </w:tcPr>
+          <w:p>
+            <w:r>
+              <w:rPr>
+                <w:b w:val="false"/>
+                <w:bCs w:val="false"/>
+                <w:color w:val="000000"/>
+                <w:sz w:val="19"/>
+                <w:szCs w:val="19"/>
+              </w:rPr>
+              <w:t xml:space="preserve">Público profissional/administradoras</w:t>
+            </w:r>
+          </w:p>
+        </w:tc>
+      </w:tr>
+      <w:tr>
+        <w:tc>
+          <w:tcPr>
+            <w:tcW w:type="dxa" w:w="3008"/>
+          </w:tcPr>
+          <w:p>
+            <w:r>
+              <w:rPr>
+                <w:b w:val="false"/>
+                <w:bCs w:val="false"/>
+                <w:color w:val="000000"/>
+                <w:sz w:val="19"/>
+                <w:szCs w:val="19"/>
+              </w:rPr>
+              <w:t xml:space="preserve">portal do síndico</w:t>
+            </w:r>
+          </w:p>
+        </w:tc>
+        <w:tc>
+          <w:tcPr>
+            <w:tcW w:type="dxa" w:w="3008"/>
+          </w:tcPr>
+          <w:p>
+            <w:r>
+              <w:rPr>
+                <w:b w:val="false"/>
+                <w:bCs w:val="false"/>
+                <w:color w:val="000000"/>
+                <w:sz w:val="19"/>
+                <w:szCs w:val="19"/>
+              </w:rPr>
+              <w:t xml:space="preserve">— (marca própria)</w:t>
+            </w:r>
+          </w:p>
+        </w:tc>
+        <w:tc>
+          <w:tcPr>
+            <w:tcW w:type="dxa" w:w="3008"/>
+          </w:tcPr>
+          <w:p>
+            <w:r>
+              <w:rPr>
+                <w:b w:val="false"/>
+                <w:bCs w:val="false"/>
+                <w:color w:val="000000"/>
+                <w:sz w:val="19"/>
+                <w:szCs w:val="19"/>
+              </w:rPr>
+              <w:t xml:space="preserve">Monitorar depois que a campanha de autoridade/orgânico rodar; tende a crescer com o reconhecimento do nome</w:t>
+            </w:r>
+          </w:p>
+        </w:tc>
+      </w:tr>
+    </w:tbl>
+    <w:p>
+      <w:pPr>
+        <w:spacing w:after="160"/>
+      </w:pPr>
+    </w:p>
+    <w:p>
+      <w:pPr>
+        <w:spacing w:after="160"/>
+      </w:pPr>
+      <w:r>
+        <w:rPr>
+          <w:b/>
+          <w:bCs/>
+          <w:sz w:val="21"/>
+          <w:szCs w:val="21"/>
+        </w:rPr>
+        <w:t xml:space="preserve">Como priorizar o orçamento:</w:t>
+      </w:r>
+      <w:r>
+        <w:rPr>
+          <w:sz w:val="21"/>
+          <w:szCs w:val="21"/>
+        </w:rPr>
+        <w:t xml:space="preserve"> concentrar o investimento nos termos de maior volume e intenção direta (sistema para síndico, programa de gestão de condomínio, aplicativo para síndico), com uma fatia menor nos termos de cauda longa, que custam menos por clique e convertem melhor por já virem com a dor bem definida.</w:t>
       </w:r>
     </w:p>
     <w:p>
@@ -917,7 +1663,7 @@
         <w:spacing w:after="150" w:before="300"/>
       </w:pPr>
       <w:r>
-        <w:t xml:space="preserve">5. Anúncios (texto, sem o nome "Portal do Síndico")</w:t>
+        <w:t xml:space="preserve">5. Anúncios (texto, com o nome Portal do Síndico)</w:t>
       </w:r>
     </w:p>
     <w:p>
@@ -944,7 +1690,7 @@
           <w:sz w:val="21"/>
           <w:szCs w:val="21"/>
         </w:rPr>
-        <w:t xml:space="preserve">"Gestão de Condomínio Mais Simples" / "Nunca Mais Perca um Prazo" / "Teste Grátis por 60 Dias"</w:t>
+        <w:t xml:space="preserve">"Portal do Síndico | Eleva" / "Gestão de Condomínio Mais Simples" / "Nunca Mais Perca um Prazo" / "Teste Grátis por 60 Dias"</w:t>
       </w:r>
     </w:p>
     <w:p>
@@ -993,25 +1739,6 @@
           <w:szCs w:val="21"/>
         </w:rPr>
         <w:t xml:space="preserve"> "Começar teste grátis" (mesmo texto do botão da página, para manter consistência).</w:t>
-      </w:r>
-    </w:p>
-    <w:p>
-      <w:pPr>
-        <w:pBdr>
-          <w:left w:val="single" w:color="cccccc" w:sz="12" w:space="8"/>
-        </w:pBdr>
-        <w:spacing w:after="120"/>
-        <w:ind w:left="400"/>
-      </w:pPr>
-      <w:r>
-        <w:rPr>
-          <w:i/>
-          <w:iCs/>
-          <w:color w:val="333333"/>
-          <w:sz w:val="20"/>
-          <w:szCs w:val="20"/>
-        </w:rPr>
-        <w:t xml:space="preserve">Observação: assim que o Giuliano confirmar o nome definitivo do produto, atualizamos títulos, descrições e palavras-chave para incluir o nome — isso tende a melhorar o índice de qualidade e o CTR.</w:t>
       </w:r>
     </w:p>
     <w:p>
@@ -1223,7 +1950,7 @@
                 <w:sz w:val="19"/>
                 <w:szCs w:val="19"/>
               </w:rPr>
-              <w:t xml:space="preserve">Confirmação do nome definitivo do produto</w:t>
+              <w:t xml:space="preserve">Portal do Síndico com acesso totalmente liberado (fora da fase de antecipação/lista de espera)</w:t>
             </w:r>
           </w:p>
         </w:tc>
@@ -1427,7 +2154,7 @@
           <w:sz w:val="21"/>
           <w:szCs w:val="21"/>
         </w:rPr>
-        <w:t xml:space="preserve">1. Confirmar com o Giuliano se o nome "Portal do Síndico" já pode ser usado ou se seguimos com o termo guarda-chuva.</w:t>
+        <w:t xml:space="preserve">1. Validar com a agência/equipe técnica se a medição de conversões já está "Gravando conversões".</w:t>
       </w:r>
     </w:p>
     <w:p>
@@ -1444,7 +2171,7 @@
           <w:sz w:val="21"/>
           <w:szCs w:val="21"/>
         </w:rPr>
-        <w:t xml:space="preserve">2. Validar com a agência/equipe técnica se a medição de conversões já está "Gravando conversões".</w:t>
+        <w:t xml:space="preserve">2. Conferir os volumes de busca reais no Planejador de Palavras-chave do Google Ads e ajustar a lista antes de publicar.</w:t>
       </w:r>
     </w:p>
     <w:p>
@@ -1461,7 +2188,7 @@
           <w:sz w:val="21"/>
           <w:szCs w:val="21"/>
         </w:rPr>
-        <w:t xml:space="preserve">3. Com o ok dele, publicar a campanha de Pesquisa com o orçamento de R$ 1.500 distribuído pela janela de pouco mais de um mês.</w:t>
+        <w:t xml:space="preserve">3. Aguardar o portal estar com acesso totalmente ativo (a antecipação segue só no orgânico) para publicar a campanha de Pesquisa, com o orçamento de R$ 1.500 distribuído pela janela de pouco mais de um mês.</w:t>
       </w:r>
     </w:p>
     <w:sectPr>

</xml_diff>

<commit_message>
Remove nota de Performance Max e ajusta texto de palavras-chave do site
Co-Authored-By: Claude Sonnet 5 <noreply@anthropic.com>
Claude-Session: https://claude.ai/code/session_01GQSqEjEuqv44iBdACeUWUZ
</commit_message>
<xml_diff>
--- a/eleva/estrutura-google-ads-portal-sindico.docx
+++ b/eleva/estrutura-google-ads-portal-sindico.docx
@@ -2143,28 +2143,7 @@
           <w:sz w:val="21"/>
           <w:szCs w:val="21"/>
         </w:rPr>
-        <w:t xml:space="preserve">Sobre Performance Max:</w:t>
-      </w:r>
-      <w:r>
-        <w:rPr>
-          <w:sz w:val="21"/>
-          <w:szCs w:val="21"/>
-        </w:rPr>
-        <w:t xml:space="preserve"> com uma verba desse tamanho, não compensa abrir uma segunda campanha em outro formato — ela competiria pelo mesmo orçamento e tornaria mais lento o aprendizado de ambas. Fica só a campanha de Pesquisa.</w:t>
-      </w:r>
-    </w:p>
-    <w:p>
-      <w:pPr>
-        <w:spacing w:after="160"/>
-      </w:pPr>
-      <w:r>
-        <w:rPr>
-          <w:b/>
-          <w:bCs/>
-          <w:sz w:val="21"/>
-          <w:szCs w:val="21"/>
-        </w:rPr>
-        <w:t xml:space="preserve">Palavras-chave extraídas do próprio site do portal (a partir dos prints que a Amanda já passou):</w:t>
+        <w:t xml:space="preserve">Para testarmos também: Palavras-chave extraídas do próprio site do portal:</w:t>
       </w:r>
       <w:r>
         <w:rPr>

</xml_diff>

<commit_message>
Acrescenta prazos de configuração (Google ~3 dias úteis, Meta ~2 dias úteis) ao cronograma de ativação
Co-Authored-By: Claude Sonnet 5 <noreply@anthropic.com>
Claude-Session: https://claude.ai/code/session_01GQSqEjEuqv44iBdACeUWUZ
</commit_message>
<xml_diff>
--- a/eleva/estrutura-google-ads-portal-sindico.docx
+++ b/eleva/estrutura-google-ads-portal-sindico.docx
@@ -2665,7 +2665,7 @@
                 <w:sz w:val="19"/>
                 <w:szCs w:val="19"/>
               </w:rPr>
-              <w:t xml:space="preserve">Ok final do Giuliano para ativar</w:t>
+              <w:t xml:space="preserve">Prazo para o Giuliano aprovar a estratégia (Google e Meta)</w:t>
             </w:r>
           </w:p>
         </w:tc>
@@ -2682,7 +2682,7 @@
                 <w:sz w:val="19"/>
                 <w:szCs w:val="19"/>
               </w:rPr>
-              <w:t xml:space="preserve">Gatilho de início</w:t>
+              <w:t xml:space="preserve">Até o dia 12/10</w:t>
             </w:r>
           </w:p>
         </w:tc>
@@ -2701,7 +2701,7 @@
                 <w:sz w:val="19"/>
                 <w:szCs w:val="19"/>
               </w:rPr>
-              <w:t xml:space="preserve">Veiculação — 1ª metade</w:t>
+              <w:t xml:space="preserve">Configuração da campanha no Google Ads</w:t>
             </w:r>
           </w:p>
         </w:tc>
@@ -2718,7 +2718,7 @@
                 <w:sz w:val="19"/>
                 <w:szCs w:val="19"/>
               </w:rPr>
-              <w:t xml:space="preserve">~15 dias, a partir do dia 13 ou 20/10 (data de lançamento)</w:t>
+              <w:t xml:space="preserve">~3 dias úteis após a aprovação (configuração mais demorada)</w:t>
             </w:r>
           </w:p>
         </w:tc>
@@ -2737,7 +2737,7 @@
                 <w:sz w:val="19"/>
                 <w:szCs w:val="19"/>
               </w:rPr>
-              <w:t xml:space="preserve">Revisão de desempenho e ajuste de lance</w:t>
+              <w:t xml:space="preserve">Configuração da campanha na Meta</w:t>
             </w:r>
           </w:p>
         </w:tc>
@@ -2754,7 +2754,7 @@
                 <w:sz w:val="19"/>
                 <w:szCs w:val="19"/>
               </w:rPr>
-              <w:t xml:space="preserve">Na virada de outubro para novembro</w:t>
+              <w:t xml:space="preserve">~2 dias úteis após a aprovação</w:t>
             </w:r>
           </w:p>
         </w:tc>
@@ -2773,7 +2773,7 @@
                 <w:sz w:val="19"/>
                 <w:szCs w:val="19"/>
               </w:rPr>
-              <w:t xml:space="preserve">Veiculação — 2ª metade</w:t>
+              <w:t xml:space="preserve">Tudo no ar (Google e Meta)</w:t>
             </w:r>
           </w:p>
         </w:tc>
@@ -2790,7 +2790,27 @@
                 <w:sz w:val="19"/>
                 <w:szCs w:val="19"/>
               </w:rPr>
-              <w:t xml:space="preserve">~15 dias, seguindo em novembro</w:t>
+              <w:t xml:space="preserve">Aprovando até 12/10, o previsto é estar tudo ativo até </w:t>
+            </w:r>
+            <w:r>
+              <w:rPr>
+                <w:b w:val="false"/>
+                <w:bCs w:val="false"/>
+                <w:color w:val="000000"/>
+                <w:sz w:val="19"/>
+                <w:szCs w:val="19"/>
+              </w:rPr>
+              <w:t xml:space="preserve">15–16/10</w:t>
+            </w:r>
+            <w:r>
+              <w:rPr>
+                <w:b w:val="false"/>
+                <w:bCs w:val="false"/>
+                <w:color w:val="000000"/>
+                <w:sz w:val="19"/>
+                <w:szCs w:val="19"/>
+              </w:rPr>
+              <w:t xml:space="preserve">, semana que vem</w:t>
             </w:r>
           </w:p>
         </w:tc>
@@ -2809,6 +2829,114 @@
                 <w:sz w:val="19"/>
                 <w:szCs w:val="19"/>
               </w:rPr>
+              <w:t xml:space="preserve">Veiculação — 1ª metade</w:t>
+            </w:r>
+          </w:p>
+        </w:tc>
+        <w:tc>
+          <w:tcPr>
+            <w:tcW w:type="dxa" w:w="4513"/>
+          </w:tcPr>
+          <w:p>
+            <w:r>
+              <w:rPr>
+                <w:b w:val="false"/>
+                <w:bCs w:val="false"/>
+                <w:color w:val="000000"/>
+                <w:sz w:val="19"/>
+                <w:szCs w:val="19"/>
+              </w:rPr>
+              <w:t xml:space="preserve">~15 dias, a partir da ativação</w:t>
+            </w:r>
+          </w:p>
+        </w:tc>
+      </w:tr>
+      <w:tr>
+        <w:tc>
+          <w:tcPr>
+            <w:tcW w:type="dxa" w:w="4513"/>
+          </w:tcPr>
+          <w:p>
+            <w:r>
+              <w:rPr>
+                <w:b w:val="false"/>
+                <w:bCs w:val="false"/>
+                <w:color w:val="000000"/>
+                <w:sz w:val="19"/>
+                <w:szCs w:val="19"/>
+              </w:rPr>
+              <w:t xml:space="preserve">Revisão de desempenho e ajuste de lance</w:t>
+            </w:r>
+          </w:p>
+        </w:tc>
+        <w:tc>
+          <w:tcPr>
+            <w:tcW w:type="dxa" w:w="4513"/>
+          </w:tcPr>
+          <w:p>
+            <w:r>
+              <w:rPr>
+                <w:b w:val="false"/>
+                <w:bCs w:val="false"/>
+                <w:color w:val="000000"/>
+                <w:sz w:val="19"/>
+                <w:szCs w:val="19"/>
+              </w:rPr>
+              <w:t xml:space="preserve">Na virada de outubro para novembro</w:t>
+            </w:r>
+          </w:p>
+        </w:tc>
+      </w:tr>
+      <w:tr>
+        <w:tc>
+          <w:tcPr>
+            <w:tcW w:type="dxa" w:w="4513"/>
+          </w:tcPr>
+          <w:p>
+            <w:r>
+              <w:rPr>
+                <w:b w:val="false"/>
+                <w:bCs w:val="false"/>
+                <w:color w:val="000000"/>
+                <w:sz w:val="19"/>
+                <w:szCs w:val="19"/>
+              </w:rPr>
+              <w:t xml:space="preserve">Veiculação — 2ª metade</w:t>
+            </w:r>
+          </w:p>
+        </w:tc>
+        <w:tc>
+          <w:tcPr>
+            <w:tcW w:type="dxa" w:w="4513"/>
+          </w:tcPr>
+          <w:p>
+            <w:r>
+              <w:rPr>
+                <w:b w:val="false"/>
+                <w:bCs w:val="false"/>
+                <w:color w:val="000000"/>
+                <w:sz w:val="19"/>
+                <w:szCs w:val="19"/>
+              </w:rPr>
+              <w:t xml:space="preserve">~15 dias, seguindo em novembro</w:t>
+            </w:r>
+          </w:p>
+        </w:tc>
+      </w:tr>
+      <w:tr>
+        <w:tc>
+          <w:tcPr>
+            <w:tcW w:type="dxa" w:w="4513"/>
+          </w:tcPr>
+          <w:p>
+            <w:r>
+              <w:rPr>
+                <w:b w:val="false"/>
+                <w:bCs w:val="false"/>
+                <w:color w:val="000000"/>
+                <w:sz w:val="19"/>
+                <w:szCs w:val="19"/>
+              </w:rPr>
               <w:t xml:space="preserve">Relatório de resultados (cadastros gerados, CPA, CTR)</w:t>
             </w:r>
           </w:p>
@@ -2836,6 +2964,20 @@
       <w:pPr>
         <w:spacing w:after="160"/>
       </w:pPr>
+    </w:p>
+    <w:p>
+      <w:pPr>
+        <w:spacing w:after="160"/>
+      </w:pPr>
+      <w:r>
+        <w:rPr>
+          <w:i/>
+          <w:iCs/>
+          <w:sz w:val="21"/>
+          <w:szCs w:val="21"/>
+        </w:rPr>
+        <w:t xml:space="preserve">Se a aprovação vier mais perto do lançamento do portal (13 ou 20/10) em vez de hoje, o prazo desliza na mesma proporção: configuração do Google em ~3 dias úteis, Meta em ~2 dias úteis, contados a partir da data real de aprovação.</w:t>
+      </w:r>
     </w:p>
     <w:p>
       <w:pPr>

</xml_diff>